<commit_message>
Add the integration with Google sheets to the Diagrams in Add campeign
</commit_message>
<xml_diff>
--- a/docs/analysis/Campaign/Add_Campaign/Narrative_Add_Campaign.docx
+++ b/docs/analysis/Campaign/Add_Campaign/Narrative_Add_Campaign.docx
@@ -63,37 +63,7 @@
               <w:rPr>
                 <w:rtl/>
               </w:rPr>
-              <w:t xml:space="preserve"> </w:t>
-            </w:r>
-            <w:r>
-              <w:rPr>
-                <w:rtl/>
-              </w:rPr>
-              <w:t>ح</w:t>
-            </w:r>
-            <w:r>
-              <w:rPr>
-                <w:rtl/>
-              </w:rPr>
-              <w:t>م</w:t>
-            </w:r>
-            <w:r>
-              <w:rPr>
-                <w:rtl/>
-              </w:rPr>
-              <w:t>ل</w:t>
-            </w:r>
-            <w:r>
-              <w:rPr>
-                <w:rtl/>
-              </w:rPr>
-              <w:t>ة</w:t>
-            </w:r>
-            <w:r>
-              <w:rPr>
-                <w:rtl/>
-              </w:rPr>
-              <w:t xml:space="preserve"> إعلانية </w:t>
+              <w:t xml:space="preserve"> حملة إعلانية </w:t>
             </w:r>
             <w:r>
               <w:t>(</w:t>
@@ -180,14 +150,56 @@
               <w:bidi/>
               <w:spacing w:after="60"/>
             </w:pPr>
-            <w:r>
-              <w:rPr>
-                <w:rtl/>
-              </w:rPr>
-              <w:t xml:space="preserve">الأدمن </w:t>
+            <w:proofErr w:type="spellStart"/>
+            <w:r>
+              <w:rPr>
+                <w:rtl/>
+              </w:rPr>
+              <w:t>الأدمن</w:t>
+            </w:r>
+            <w:proofErr w:type="spellEnd"/>
+            <w:r>
+              <w:rPr>
+                <w:rtl/>
+              </w:rPr>
+              <w:t xml:space="preserve"> </w:t>
             </w:r>
             <w:r>
               <w:t>(Admin)</w:t>
+            </w:r>
+          </w:p>
+          <w:p>
+            <w:pPr>
+              <w:bidi/>
+              <w:spacing w:after="60"/>
+            </w:pPr>
+            <w:proofErr w:type="spellStart"/>
+            <w:r>
+              <w:rPr>
+                <w:rtl/>
+              </w:rPr>
+              <w:t>Google</w:t>
+            </w:r>
+            <w:proofErr w:type="spellEnd"/>
+            <w:r>
+              <w:rPr>
+                <w:rtl/>
+              </w:rPr>
+              <w:t xml:space="preserve"> </w:t>
+            </w:r>
+            <w:proofErr w:type="spellStart"/>
+            <w:r>
+              <w:rPr>
+                <w:rtl/>
+              </w:rPr>
+              <w:t>Sheets</w:t>
+            </w:r>
+            <w:proofErr w:type="spellEnd"/>
+            <w:r>
+              <w:rPr>
+                <w:rtl/>
+              </w:rPr>
+              <w:t xml:space="preserve"> </w:t>
             </w:r>
           </w:p>
         </w:tc>
@@ -254,7 +266,49 @@
               <w:rPr>
                 <w:rtl/>
               </w:rPr>
-              <w:t>تمكين مدير التسويق أو الأدمن من تسجيل حملة إعلانية جديدة بتحديد المنصات والميزانية والفترة الزمنية والمسار المستهدف، لتتبع مصدر العملاء وقياس فعالية الحملات.</w:t>
+              <w:t xml:space="preserve">تمكين مدير التسويق أو </w:t>
+            </w:r>
+            <w:proofErr w:type="spellStart"/>
+            <w:r>
+              <w:rPr>
+                <w:rtl/>
+              </w:rPr>
+              <w:t>الأدمن</w:t>
+            </w:r>
+            <w:proofErr w:type="spellEnd"/>
+            <w:r>
+              <w:rPr>
+                <w:rtl/>
+              </w:rPr>
+              <w:t xml:space="preserve"> من تسجيل حملة إعلانية جديدة بتحديد المنصات والميزانية والفترة الزمنية والمسار المستهدف، وربطها بأسئلتها من </w:t>
+            </w:r>
+            <w:proofErr w:type="spellStart"/>
+            <w:r>
+              <w:rPr>
+                <w:rtl/>
+              </w:rPr>
+              <w:t>Google</w:t>
+            </w:r>
+            <w:proofErr w:type="spellEnd"/>
+            <w:r>
+              <w:rPr>
+                <w:rtl/>
+              </w:rPr>
+              <w:t xml:space="preserve"> </w:t>
+            </w:r>
+            <w:proofErr w:type="spellStart"/>
+            <w:r>
+              <w:rPr>
+                <w:rtl/>
+              </w:rPr>
+              <w:t>Sheets</w:t>
+            </w:r>
+            <w:proofErr w:type="spellEnd"/>
+            <w:r>
+              <w:rPr>
+                <w:rtl/>
+              </w:rPr>
+              <w:t>، لتتبع مصدر العملاء وقياس فعالية الحملات.</w:t>
             </w:r>
           </w:p>
         </w:tc>
@@ -321,13 +375,117 @@
               <w:rPr>
                 <w:rtl/>
               </w:rPr>
-              <w:t xml:space="preserve">يقوم المستخدم بإدخال بيانات الحملة الإعلانية، ثم يتحقق النظام من اكتمال البيانات وصحتها، </w:t>
-            </w:r>
-            <w:r>
-              <w:rPr>
-                <w:rtl/>
-              </w:rPr>
-              <w:t>ويحفظ الحملة بحالة "جديدة (New)"، ويرسل طلب موافقة إلى الأدمن لتصبح الحملة "مثبتة"، ويسجل العملية في سجل التدقيق. الموافقة إجراء إداري فقط ولا تعني تشغيل الحملة من النظام، فالموظفون ينفذون الحملة خارج النظام، وتصل بيانات عملائها لاحقاً من Google Sheets.</w:t>
+              <w:t xml:space="preserve">يقوم المستخدم بإدخال بيانات الحملة الإعلانية ورابط </w:t>
+            </w:r>
+            <w:proofErr w:type="spellStart"/>
+            <w:r>
+              <w:rPr>
+                <w:rtl/>
+              </w:rPr>
+              <w:t>Goog</w:t>
+            </w:r>
+            <w:r>
+              <w:rPr>
+                <w:rtl/>
+              </w:rPr>
+              <w:t>le</w:t>
+            </w:r>
+            <w:proofErr w:type="spellEnd"/>
+            <w:r>
+              <w:rPr>
+                <w:rtl/>
+              </w:rPr>
+              <w:t xml:space="preserve"> </w:t>
+            </w:r>
+            <w:proofErr w:type="spellStart"/>
+            <w:r>
+              <w:rPr>
+                <w:rtl/>
+              </w:rPr>
+              <w:t>Sheets</w:t>
+            </w:r>
+            <w:proofErr w:type="spellEnd"/>
+            <w:r>
+              <w:rPr>
+                <w:rtl/>
+              </w:rPr>
+              <w:t xml:space="preserve"> الخاص بها، فيجلب النظام أسئلة الحملة منه. يربط المستخدم كل سؤال بحقل مقابل في قاعدة البيانات، ويضيف وسماً (</w:t>
+            </w:r>
+            <w:proofErr w:type="spellStart"/>
+            <w:r>
+              <w:rPr>
+                <w:rtl/>
+              </w:rPr>
+              <w:t>Tag</w:t>
+            </w:r>
+            <w:proofErr w:type="spellEnd"/>
+            <w:r>
+              <w:rPr>
+                <w:rtl/>
+              </w:rPr>
+              <w:t>) للأسئلة التي لا يوجد لها جدول مقابل. ثم يتحقق النظام من اكتمال البيانات وصحتها، ويحفظ الحملة بحالة "جديدة (</w:t>
+            </w:r>
+            <w:proofErr w:type="spellStart"/>
+            <w:r>
+              <w:rPr>
+                <w:rtl/>
+              </w:rPr>
+              <w:t>New</w:t>
+            </w:r>
+            <w:proofErr w:type="spellEnd"/>
+            <w:r>
+              <w:rPr>
+                <w:rtl/>
+              </w:rPr>
+              <w:t>)"، ويرسل إشعاراً تلقائي</w:t>
+            </w:r>
+            <w:r>
+              <w:rPr>
+                <w:rtl/>
+              </w:rPr>
+              <w:t xml:space="preserve">اً إلى </w:t>
+            </w:r>
+            <w:proofErr w:type="spellStart"/>
+            <w:r>
+              <w:rPr>
+                <w:rtl/>
+              </w:rPr>
+              <w:t>الأدمن</w:t>
+            </w:r>
+            <w:proofErr w:type="spellEnd"/>
+            <w:r>
+              <w:rPr>
+                <w:rtl/>
+              </w:rPr>
+              <w:t xml:space="preserve"> لطلب الموافقة، ويسجل العملية في سجل التدقيق. لا يمكن حفظ الحملة دون ربط أسئلتها. الموافقة إجراء إداري فقط ولا تعني تشغيل الحملة من النظام، فالموظفون ينفذون الحملة خارج النظام، وتصل بيانات عملائها لاحقاً من </w:t>
+            </w:r>
+            <w:proofErr w:type="spellStart"/>
+            <w:r>
+              <w:rPr>
+                <w:rtl/>
+              </w:rPr>
+              <w:t>Google</w:t>
+            </w:r>
+            <w:proofErr w:type="spellEnd"/>
+            <w:r>
+              <w:rPr>
+                <w:rtl/>
+              </w:rPr>
+              <w:t xml:space="preserve"> </w:t>
+            </w:r>
+            <w:proofErr w:type="spellStart"/>
+            <w:r>
+              <w:rPr>
+                <w:rtl/>
+              </w:rPr>
+              <w:t>Sheets</w:t>
+            </w:r>
+            <w:proofErr w:type="spellEnd"/>
+            <w:r>
+              <w:rPr>
+                <w:rtl/>
+              </w:rPr>
+              <w:t>.</w:t>
             </w:r>
           </w:p>
         </w:tc>
@@ -357,14 +515,7 @@
                 <w:b/>
                 <w:bCs/>
               </w:rPr>
-              <w:t>Ov</w:t>
-            </w:r>
-            <w:r>
-              <w:rPr>
-                <w:b/>
-                <w:bCs/>
-              </w:rPr>
-              <w:t>erview</w:t>
+              <w:t>Overview</w:t>
             </w:r>
           </w:p>
         </w:tc>
@@ -470,19 +621,101 @@
               <w:rPr>
                 <w:rtl/>
               </w:rPr>
-              <w:t>قام المستخدم (مدير التسويق أو الأدمن) بتسجيل الدخول بنجاح.</w:t>
-            </w:r>
-          </w:p>
-          <w:p>
-            <w:pPr>
-              <w:bidi/>
-              <w:spacing w:after="60"/>
-            </w:pPr>
-            <w:r>
-              <w:rPr>
-                <w:rtl/>
-              </w:rPr>
-              <w:t>توجد مسارات (Tracks) معرّفة في النظام ولكل مسار كورساته.</w:t>
+              <w:t xml:space="preserve">قام المستخدم (مدير التسويق أو </w:t>
+            </w:r>
+            <w:proofErr w:type="spellStart"/>
+            <w:r>
+              <w:rPr>
+                <w:rtl/>
+              </w:rPr>
+              <w:t>الأدمن</w:t>
+            </w:r>
+            <w:proofErr w:type="spellEnd"/>
+            <w:r>
+              <w:rPr>
+                <w:rtl/>
+              </w:rPr>
+              <w:t>) بتسجيل الدخول بنجاح.</w:t>
+            </w:r>
+          </w:p>
+          <w:p>
+            <w:pPr>
+              <w:bidi/>
+              <w:spacing w:after="60"/>
+            </w:pPr>
+            <w:r>
+              <w:rPr>
+                <w:rtl/>
+              </w:rPr>
+              <w:t>توجد مسارات (</w:t>
+            </w:r>
+            <w:proofErr w:type="spellStart"/>
+            <w:r>
+              <w:rPr>
+                <w:rtl/>
+              </w:rPr>
+              <w:t>Tracks</w:t>
+            </w:r>
+            <w:proofErr w:type="spellEnd"/>
+            <w:r>
+              <w:rPr>
+                <w:rtl/>
+              </w:rPr>
+              <w:t xml:space="preserve">) معرّفة في النظام ولكل مسار </w:t>
+            </w:r>
+            <w:proofErr w:type="spellStart"/>
+            <w:r>
+              <w:rPr>
+                <w:rtl/>
+              </w:rPr>
+              <w:t>كورساته</w:t>
+            </w:r>
+            <w:proofErr w:type="spellEnd"/>
+            <w:r>
+              <w:rPr>
+                <w:rtl/>
+              </w:rPr>
+              <w:t>.</w:t>
+            </w:r>
+          </w:p>
+          <w:p>
+            <w:pPr>
+              <w:bidi/>
+              <w:spacing w:after="60"/>
+            </w:pPr>
+            <w:r>
+              <w:rPr>
+                <w:rtl/>
+              </w:rPr>
+              <w:t xml:space="preserve">يملك المستخدم رابط </w:t>
+            </w:r>
+            <w:proofErr w:type="spellStart"/>
+            <w:r>
+              <w:rPr>
+                <w:rtl/>
+              </w:rPr>
+              <w:t>Google</w:t>
+            </w:r>
+            <w:proofErr w:type="spellEnd"/>
+            <w:r>
+              <w:rPr>
+                <w:rtl/>
+              </w:rPr>
+              <w:t xml:space="preserve"> </w:t>
+            </w:r>
+            <w:proofErr w:type="spellStart"/>
+            <w:r>
+              <w:rPr>
+                <w:rtl/>
+              </w:rPr>
+              <w:t>Sheets</w:t>
+            </w:r>
+            <w:proofErr w:type="spellEnd"/>
+            <w:r>
+              <w:rPr>
+                <w:rtl/>
+              </w:rPr>
+              <w:t xml:space="preserve"> الخاص بالحملة، ويملك النظام صلاحية قراءته.</w:t>
             </w:r>
           </w:p>
         </w:tc>
@@ -549,19 +782,79 @@
               <w:rPr>
                 <w:rtl/>
               </w:rPr>
-              <w:t>يتم حفظ الحملة في النظام بالحالة "جديدة (New)".</w:t>
-            </w:r>
-          </w:p>
-          <w:p>
-            <w:pPr>
-              <w:bidi/>
-              <w:spacing w:after="60"/>
-            </w:pPr>
-            <w:r>
-              <w:rPr>
-                <w:rtl/>
-              </w:rPr>
-              <w:t>يتم إرسال طلب موافقة إلى الأدمن، وتصبح الحملة "مثبتة" بعد موافقته.</w:t>
+              <w:t xml:space="preserve">يتم حفظ الحملة في النظام بالحالة </w:t>
+            </w:r>
+            <w:r>
+              <w:rPr>
+                <w:rtl/>
+              </w:rPr>
+              <w:t>"جديدة (</w:t>
+            </w:r>
+            <w:proofErr w:type="spellStart"/>
+            <w:r>
+              <w:rPr>
+                <w:rtl/>
+              </w:rPr>
+              <w:t>New</w:t>
+            </w:r>
+            <w:proofErr w:type="spellEnd"/>
+            <w:r>
+              <w:rPr>
+                <w:rtl/>
+              </w:rPr>
+              <w:t>)".</w:t>
+            </w:r>
+          </w:p>
+          <w:p>
+            <w:pPr>
+              <w:bidi/>
+              <w:spacing w:after="60"/>
+            </w:pPr>
+            <w:r>
+              <w:rPr>
+                <w:rtl/>
+              </w:rPr>
+              <w:t>ترتبط كل أسئلة الحملة بحقل في قاعدة البيانات أو بوسم (</w:t>
+            </w:r>
+            <w:proofErr w:type="spellStart"/>
+            <w:r>
+              <w:rPr>
+                <w:rtl/>
+              </w:rPr>
+              <w:t>Tag</w:t>
+            </w:r>
+            <w:proofErr w:type="spellEnd"/>
+            <w:r>
+              <w:rPr>
+                <w:rtl/>
+              </w:rPr>
+              <w:t>).</w:t>
+            </w:r>
+          </w:p>
+          <w:p>
+            <w:pPr>
+              <w:bidi/>
+              <w:spacing w:after="60"/>
+            </w:pPr>
+            <w:r>
+              <w:rPr>
+                <w:rtl/>
+              </w:rPr>
+              <w:t xml:space="preserve">يتم إرسال إشعار تلقائي إلى </w:t>
+            </w:r>
+            <w:proofErr w:type="spellStart"/>
+            <w:r>
+              <w:rPr>
+                <w:rtl/>
+              </w:rPr>
+              <w:t>الأدمن</w:t>
+            </w:r>
+            <w:proofErr w:type="spellEnd"/>
+            <w:r>
+              <w:rPr>
+                <w:rtl/>
+              </w:rPr>
+              <w:t xml:space="preserve"> بطلب الموافقة، وتصبح الحملة "مثبتة" بعد موافقته.</w:t>
             </w:r>
           </w:p>
           <w:p>
@@ -585,7 +878,35 @@
               <w:rPr>
                 <w:rtl/>
               </w:rPr>
-              <w:t>لا تؤدي الموافقة إلى تنفيذ أي إجراء فعلي على الحملة، وتبقى بياناتها مرجعاً لربط العملاء الواردين من Google Sheets بحملاتهم.</w:t>
+              <w:t xml:space="preserve">لا تؤدي الموافقة إلى تنفيذ أي إجراء فعلي على الحملة، وتبقى بياناتها مرجعاً لربط العملاء الواردين من </w:t>
+            </w:r>
+            <w:proofErr w:type="spellStart"/>
+            <w:r>
+              <w:rPr>
+                <w:rtl/>
+              </w:rPr>
+              <w:t>Google</w:t>
+            </w:r>
+            <w:proofErr w:type="spellEnd"/>
+            <w:r>
+              <w:rPr>
+                <w:rtl/>
+              </w:rPr>
+              <w:t xml:space="preserve"> </w:t>
+            </w:r>
+            <w:proofErr w:type="spellStart"/>
+            <w:r>
+              <w:rPr>
+                <w:rtl/>
+              </w:rPr>
+              <w:t>Sheets</w:t>
+            </w:r>
+            <w:proofErr w:type="spellEnd"/>
+            <w:r>
+              <w:rPr>
+                <w:rtl/>
+              </w:rPr>
+              <w:t xml:space="preserve"> بحملاتهم.</w:t>
             </w:r>
           </w:p>
         </w:tc>
@@ -652,7 +973,41 @@
               <w:rPr>
                 <w:rtl/>
               </w:rPr>
-              <w:t>يجب أن تكون الميزانية وتاريخ البداية وتاريخ النهاية والمسار المستهدف حقولاً إلزامية، وأن تكون المنصات الإعلانية اختيارية.</w:t>
+              <w:t xml:space="preserve">يجب أن تكون الميزانية وتاريخ البداية وتاريخ النهاية والمسار المستهدف ورابط </w:t>
+            </w:r>
+            <w:proofErr w:type="spellStart"/>
+            <w:r>
+              <w:rPr>
+                <w:rtl/>
+              </w:rPr>
+              <w:t>Google</w:t>
+            </w:r>
+            <w:proofErr w:type="spellEnd"/>
+            <w:r>
+              <w:rPr>
+                <w:rtl/>
+              </w:rPr>
+              <w:t xml:space="preserve"> </w:t>
+            </w:r>
+            <w:proofErr w:type="spellStart"/>
+            <w:r>
+              <w:rPr>
+                <w:rtl/>
+              </w:rPr>
+              <w:t>Sheets</w:t>
+            </w:r>
+            <w:proofErr w:type="spellEnd"/>
+            <w:r>
+              <w:rPr>
+                <w:rtl/>
+              </w:rPr>
+              <w:t xml:space="preserve"> حقولاً إلزامية، وأن تكون ال</w:t>
+            </w:r>
+            <w:r>
+              <w:rPr>
+                <w:rtl/>
+              </w:rPr>
+              <w:t>منصات الإعلانية اختيارية.</w:t>
             </w:r>
           </w:p>
           <w:p>
@@ -676,6 +1031,78 @@
               <w:rPr>
                 <w:rtl/>
               </w:rPr>
+              <w:t xml:space="preserve">يجب جلب أسئلة الحملة من </w:t>
+            </w:r>
+            <w:proofErr w:type="spellStart"/>
+            <w:r>
+              <w:rPr>
+                <w:rtl/>
+              </w:rPr>
+              <w:t>Google</w:t>
+            </w:r>
+            <w:proofErr w:type="spellEnd"/>
+            <w:r>
+              <w:rPr>
+                <w:rtl/>
+              </w:rPr>
+              <w:t xml:space="preserve"> </w:t>
+            </w:r>
+            <w:proofErr w:type="spellStart"/>
+            <w:r>
+              <w:rPr>
+                <w:rtl/>
+              </w:rPr>
+              <w:t>Sheets</w:t>
+            </w:r>
+            <w:proofErr w:type="spellEnd"/>
+            <w:r>
+              <w:rPr>
+                <w:rtl/>
+              </w:rPr>
+              <w:t>، ولا يمكن حفظ الحملة دون ربط أسئلتها.</w:t>
+            </w:r>
+          </w:p>
+          <w:p>
+            <w:pPr>
+              <w:bidi/>
+              <w:spacing w:after="60"/>
+            </w:pPr>
+            <w:r>
+              <w:rPr>
+                <w:rtl/>
+              </w:rPr>
+              <w:t>يجب أن يتيح النظام ربط كل سؤال بحقل في قاعدة البيانات، وإضافة وسم (</w:t>
+            </w:r>
+            <w:proofErr w:type="spellStart"/>
+            <w:r>
+              <w:rPr>
+                <w:rtl/>
+              </w:rPr>
+              <w:t>Tag</w:t>
+            </w:r>
+            <w:proofErr w:type="spellEnd"/>
+            <w:r>
+              <w:rPr>
+                <w:rtl/>
+              </w:rPr>
+              <w:t>) للسؤا</w:t>
+            </w:r>
+            <w:r>
+              <w:rPr>
+                <w:rtl/>
+              </w:rPr>
+              <w:t>ل الذي لا يوجد له جدول مقابل.</w:t>
+            </w:r>
+          </w:p>
+          <w:p>
+            <w:pPr>
+              <w:bidi/>
+              <w:spacing w:after="60"/>
+            </w:pPr>
+            <w:r>
+              <w:rPr>
+                <w:rtl/>
+              </w:rPr>
               <w:t>يجب إنشاء جدول يربط الحملة بالعميل ليُعرف مصدر كل عميل.</w:t>
             </w:r>
           </w:p>
@@ -688,37 +1115,51 @@
               <w:rPr>
                 <w:rtl/>
               </w:rPr>
-              <w:t>ي</w:t>
-            </w:r>
-            <w:r>
-              <w:rPr>
-                <w:rtl/>
-              </w:rPr>
-              <w:t>جب تسجيل منفذ العملية وتاريخها ووقتها في سجل التدقيق.</w:t>
-            </w:r>
-          </w:p>
-          <w:p>
-            <w:pPr>
-              <w:bidi/>
-              <w:spacing w:after="60"/>
-            </w:pPr>
-            <w:r>
-              <w:rPr>
-                <w:rtl/>
-              </w:rPr>
-              <w:t>لا تصبح الحملة مثبتة إلا بعد موافقة الأدمن، وتتم المراجعة في حالة الاستخدام "مراجعة حملة إعلانية".</w:t>
-            </w:r>
-          </w:p>
-          <w:p>
-            <w:pPr>
-              <w:bidi/>
-              <w:spacing w:after="60"/>
-            </w:pPr>
-            <w:r>
-              <w:rPr>
-                <w:rtl/>
-              </w:rPr>
-              <w:t>لا يتحكم النظام في تنفيذ الحملة فعلياً، فهي تُنفذ من قبل الموظفين خارج النظام.</w:t>
+              <w:t>يجب تسجيل منفذ العملية وتاريخها ووقتها في سجل التدقيق.</w:t>
+            </w:r>
+          </w:p>
+          <w:p>
+            <w:pPr>
+              <w:bidi/>
+              <w:spacing w:after="60"/>
+            </w:pPr>
+            <w:r>
+              <w:rPr>
+                <w:rtl/>
+              </w:rPr>
+              <w:t xml:space="preserve">لا تصبح الحملة مثبتة إلا بعد موافقة </w:t>
+            </w:r>
+            <w:proofErr w:type="spellStart"/>
+            <w:r>
+              <w:rPr>
+                <w:rtl/>
+              </w:rPr>
+              <w:t>الأدمن</w:t>
+            </w:r>
+            <w:proofErr w:type="spellEnd"/>
+            <w:r>
+              <w:rPr>
+                <w:rtl/>
+              </w:rPr>
+              <w:t>، وتتم المراجعة في حالة الاستخدام "مراجعة حملة إعلانية".</w:t>
+            </w:r>
+          </w:p>
+          <w:p>
+            <w:pPr>
+              <w:bidi/>
+              <w:spacing w:after="60"/>
+            </w:pPr>
+            <w:r>
+              <w:rPr>
+                <w:rtl/>
+              </w:rPr>
+              <w:t xml:space="preserve">لا يتحكم النظام </w:t>
+            </w:r>
+            <w:r>
+              <w:rPr>
+                <w:rtl/>
+              </w:rPr>
+              <w:t>في تنفيذ الحملة فعلياً، فهي تُنفذ من قبل الموظفين خارج النظام.</w:t>
             </w:r>
           </w:p>
         </w:tc>
@@ -827,22 +1268,34 @@
                     <w:spacing w:after="60"/>
                     <w:jc w:val="center"/>
                   </w:pPr>
+                  <w:proofErr w:type="spellStart"/>
                   <w:r>
                     <w:rPr>
                       <w:b/>
                       <w:bCs/>
                       <w:rtl/>
                     </w:rPr>
-                    <w:t>Sy</w:t>
-                  </w:r>
+                    <w:t>System</w:t>
+                  </w:r>
+                  <w:proofErr w:type="spellEnd"/>
                   <w:r>
                     <w:rPr>
                       <w:b/>
                       <w:bCs/>
                       <w:rtl/>
                     </w:rPr>
-                    <w:t>stem Response</w:t>
-                  </w:r>
+                    <w:t xml:space="preserve"> </w:t>
+                  </w:r>
+                  <w:proofErr w:type="spellStart"/>
+                  <w:r>
+                    <w:rPr>
+                      <w:b/>
+                      <w:bCs/>
+                      <w:rtl/>
+                    </w:rPr>
+                    <w:t>Response</w:t>
+                  </w:r>
+                  <w:proofErr w:type="spellEnd"/>
                 </w:p>
               </w:tc>
               <w:tc>
@@ -867,14 +1320,34 @@
                     <w:spacing w:after="60"/>
                     <w:jc w:val="center"/>
                   </w:pPr>
+                  <w:proofErr w:type="spellStart"/>
                   <w:r>
                     <w:rPr>
                       <w:b/>
                       <w:bCs/>
                       <w:rtl/>
                     </w:rPr>
-                    <w:t>Actor Action</w:t>
-                  </w:r>
+                    <w:t>Actor</w:t>
+                  </w:r>
+                  <w:proofErr w:type="spellEnd"/>
+                  <w:r>
+                    <w:rPr>
+                      <w:b/>
+                      <w:bCs/>
+                      <w:rtl/>
+                    </w:rPr>
+                    <w:t xml:space="preserve"> </w:t>
+                  </w:r>
+                  <w:proofErr w:type="spellStart"/>
+                  <w:r>
+                    <w:rPr>
+                      <w:b/>
+                      <w:bCs/>
+                      <w:rtl/>
+                    </w:rPr>
+                    <w:t>Action</w:t>
+                  </w:r>
+                  <w:proofErr w:type="spellEnd"/>
                 </w:p>
               </w:tc>
             </w:tr>
@@ -933,7 +1406,21 @@
                     <w:rPr>
                       <w:rtl/>
                     </w:rPr>
-                    <w:t>1. يختار مدير التسويق (أو الأدمن) تسجيل حملة إعلانية جديدة</w:t>
+                    <w:t xml:space="preserve">1. يختار المستخدم (مدير التسويق أو </w:t>
+                  </w:r>
+                  <w:proofErr w:type="spellStart"/>
+                  <w:r>
+                    <w:rPr>
+                      <w:rtl/>
+                    </w:rPr>
+                    <w:t>الأدمن</w:t>
+                  </w:r>
+                  <w:proofErr w:type="spellEnd"/>
+                  <w:r>
+                    <w:rPr>
+                      <w:rtl/>
+                    </w:rPr>
+                    <w:t>) تسجيل حملة إعلانية جديدة</w:t>
                   </w:r>
                 </w:p>
               </w:tc>
@@ -970,7 +1457,35 @@
                     <w:rPr>
                       <w:rtl/>
                     </w:rPr>
-                    <w:t>2. يعرض النظام نموذج تسجيل الحملة (المنصات، الميزانية، تاريخ البداية، تاريخ النهاية، المسار المستهدف).</w:t>
+                    <w:t xml:space="preserve">2. يعرض النظام نموذج تسجيل الحملة (المنصات، الميزانية، تاريخ البداية، تاريخ النهاية، المسار المستهدف، رابط </w:t>
+                  </w:r>
+                  <w:proofErr w:type="spellStart"/>
+                  <w:r>
+                    <w:rPr>
+                      <w:rtl/>
+                    </w:rPr>
+                    <w:t>Google</w:t>
+                  </w:r>
+                  <w:proofErr w:type="spellEnd"/>
+                  <w:r>
+                    <w:rPr>
+                      <w:rtl/>
+                    </w:rPr>
+                    <w:t xml:space="preserve"> </w:t>
+                  </w:r>
+                  <w:proofErr w:type="spellStart"/>
+                  <w:r>
+                    <w:rPr>
+                      <w:rtl/>
+                    </w:rPr>
+                    <w:t>Sheets</w:t>
+                  </w:r>
+                  <w:proofErr w:type="spellEnd"/>
+                  <w:r>
+                    <w:rPr>
+                      <w:rtl/>
+                    </w:rPr>
+                    <w:t xml:space="preserve"> الخاص بالحملة).</w:t>
                   </w:r>
                 </w:p>
               </w:tc>
@@ -1053,7 +1568,55 @@
                     <w:rPr>
                       <w:rtl/>
                     </w:rPr>
-                    <w:t>3. يدخل المستخدم بيانات الحملة: المنصات الإعلانية (اختياري)، الميزانية، تاريخ البداية، تاريخ النهاية، ويختار المسار المستهدف (Track)</w:t>
+                    <w:t xml:space="preserve">3. يدخل المستخدم بيانات الحملة: المنصات الإعلانية (اختياري)، الميزانية، تاريخ البداية، تاريخ النهاية، ويختار المسار </w:t>
+                  </w:r>
+                  <w:r>
+                    <w:rPr>
+                      <w:rtl/>
+                    </w:rPr>
+                    <w:t>المستهدف (</w:t>
+                  </w:r>
+                  <w:proofErr w:type="spellStart"/>
+                  <w:r>
+                    <w:rPr>
+                      <w:rtl/>
+                    </w:rPr>
+                    <w:t>Track</w:t>
+                  </w:r>
+                  <w:proofErr w:type="spellEnd"/>
+                  <w:r>
+                    <w:rPr>
+                      <w:rtl/>
+                    </w:rPr>
+                    <w:t xml:space="preserve">)، ويدخل رابط </w:t>
+                  </w:r>
+                  <w:proofErr w:type="spellStart"/>
+                  <w:r>
+                    <w:rPr>
+                      <w:rtl/>
+                    </w:rPr>
+                    <w:t>Google</w:t>
+                  </w:r>
+                  <w:proofErr w:type="spellEnd"/>
+                  <w:r>
+                    <w:rPr>
+                      <w:rtl/>
+                    </w:rPr>
+                    <w:t xml:space="preserve"> </w:t>
+                  </w:r>
+                  <w:proofErr w:type="spellStart"/>
+                  <w:r>
+                    <w:rPr>
+                      <w:rtl/>
+                    </w:rPr>
+                    <w:t>Sheets</w:t>
+                  </w:r>
+                  <w:proofErr w:type="spellEnd"/>
+                  <w:r>
+                    <w:rPr>
+                      <w:rtl/>
+                    </w:rPr>
+                    <w:t xml:space="preserve"> الخاص بالحملة</w:t>
                   </w:r>
                 </w:p>
               </w:tc>
@@ -1113,13 +1676,7 @@
                     <w:rPr>
                       <w:rtl/>
                     </w:rPr>
-                    <w:t>4. يضغط المستخد</w:t>
-                  </w:r>
-                  <w:r>
-                    <w:rPr>
-                      <w:rtl/>
-                    </w:rPr>
-                    <w:t>م على حفظ</w:t>
+                    <w:t>4. يضغط المستخدم على جلب الأسئلة</w:t>
                   </w:r>
                 </w:p>
               </w:tc>
@@ -1156,7 +1713,35 @@
                     <w:rPr>
                       <w:rtl/>
                     </w:rPr>
-                    <w:t>5. يتحقق النظام من اكتمال الحقول الإلزامية ومن صحة القيم (الميزانية وتسلسل التواريخ).</w:t>
+                    <w:t xml:space="preserve">5. يتصل النظام بـ </w:t>
+                  </w:r>
+                  <w:proofErr w:type="spellStart"/>
+                  <w:r>
+                    <w:rPr>
+                      <w:rtl/>
+                    </w:rPr>
+                    <w:t>Google</w:t>
+                  </w:r>
+                  <w:proofErr w:type="spellEnd"/>
+                  <w:r>
+                    <w:rPr>
+                      <w:rtl/>
+                    </w:rPr>
+                    <w:t xml:space="preserve"> </w:t>
+                  </w:r>
+                  <w:proofErr w:type="spellStart"/>
+                  <w:r>
+                    <w:rPr>
+                      <w:rtl/>
+                    </w:rPr>
+                    <w:t>Sheets</w:t>
+                  </w:r>
+                  <w:proofErr w:type="spellEnd"/>
+                  <w:r>
+                    <w:rPr>
+                      <w:rtl/>
+                    </w:rPr>
+                    <w:t xml:space="preserve"> ويجلب أسئلة الحملة.</w:t>
                   </w:r>
                 </w:p>
               </w:tc>
@@ -1216,8 +1801,7 @@
                     <w:rPr>
                       <w:rtl/>
                     </w:rPr>
-                    <w:lastRenderedPageBreak/>
-                    <w:t>6. يحفظ النظام الحملة بالحالة الابتدائية "جديدة (New)" ويهيئ ربطها بالعملاء عبر جدول الحملة والعميل.</w:t>
+                    <w:t>6. يعرض النظام الأسئلة المجلوبة مع حقول قاعدة البيانات المتاحة للربط.</w:t>
                   </w:r>
                 </w:p>
               </w:tc>
@@ -1273,11 +1857,211 @@
                     <w:bidi/>
                     <w:spacing w:after="60"/>
                   </w:pPr>
-                  <w:r>
-                    <w:rPr>
-                      <w:rtl/>
-                    </w:rPr>
-                    <w:t>7. يسجل النظام العملية في سجل التدقيق (المنفذ وتاريخ ووقت التنفيذ).</w:t>
+                </w:p>
+              </w:tc>
+              <w:tc>
+                <w:tcPr>
+                  <w:tcW w:w="3250" w:type="dxa"/>
+                  <w:tcBorders>
+                    <w:top w:val="single" w:sz="6" w:space="0" w:color="000000"/>
+                    <w:left w:val="single" w:sz="6" w:space="0" w:color="000000"/>
+                    <w:bottom w:val="single" w:sz="6" w:space="0" w:color="000000"/>
+                    <w:right w:val="single" w:sz="6" w:space="0" w:color="000000"/>
+                  </w:tcBorders>
+                  <w:tcMar>
+                    <w:top w:w="80" w:type="dxa"/>
+                    <w:left w:w="120" w:type="dxa"/>
+                    <w:bottom w:w="80" w:type="dxa"/>
+                    <w:right w:w="120" w:type="dxa"/>
+                  </w:tcMar>
+                </w:tcPr>
+                <w:p>
+                  <w:pPr>
+                    <w:bidi/>
+                    <w:spacing w:after="60"/>
+                  </w:pPr>
+                  <w:r>
+                    <w:rPr>
+                      <w:rtl/>
+                    </w:rPr>
+                    <w:t>7. يربط المستخدم كل سؤال بالحقل المقابل له في قاعدة البيانات</w:t>
+                  </w:r>
+                </w:p>
+              </w:tc>
+            </w:tr>
+            <w:tr>
+              <w:tblPrEx>
+                <w:tblCellMar>
+                  <w:top w:w="0" w:type="dxa"/>
+                  <w:bottom w:w="0" w:type="dxa"/>
+                </w:tblCellMar>
+              </w:tblPrEx>
+              <w:tc>
+                <w:tcPr>
+                  <w:tcW w:w="3250" w:type="dxa"/>
+                  <w:tcBorders>
+                    <w:top w:val="single" w:sz="6" w:space="0" w:color="000000"/>
+                    <w:left w:val="single" w:sz="6" w:space="0" w:color="000000"/>
+                    <w:bottom w:val="single" w:sz="6" w:space="0" w:color="000000"/>
+                    <w:right w:val="single" w:sz="6" w:space="0" w:color="000000"/>
+                  </w:tcBorders>
+                  <w:tcMar>
+                    <w:top w:w="80" w:type="dxa"/>
+                    <w:left w:w="120" w:type="dxa"/>
+                    <w:bottom w:w="80" w:type="dxa"/>
+                    <w:right w:w="120" w:type="dxa"/>
+                  </w:tcMar>
+                </w:tcPr>
+                <w:p>
+                  <w:pPr>
+                    <w:bidi/>
+                    <w:spacing w:after="60"/>
+                  </w:pPr>
+                </w:p>
+              </w:tc>
+              <w:tc>
+                <w:tcPr>
+                  <w:tcW w:w="3250" w:type="dxa"/>
+                  <w:tcBorders>
+                    <w:top w:val="single" w:sz="6" w:space="0" w:color="000000"/>
+                    <w:left w:val="single" w:sz="6" w:space="0" w:color="000000"/>
+                    <w:bottom w:val="single" w:sz="6" w:space="0" w:color="000000"/>
+                    <w:right w:val="single" w:sz="6" w:space="0" w:color="000000"/>
+                  </w:tcBorders>
+                  <w:tcMar>
+                    <w:top w:w="80" w:type="dxa"/>
+                    <w:left w:w="120" w:type="dxa"/>
+                    <w:bottom w:w="80" w:type="dxa"/>
+                    <w:right w:w="120" w:type="dxa"/>
+                  </w:tcMar>
+                </w:tcPr>
+                <w:p>
+                  <w:pPr>
+                    <w:bidi/>
+                    <w:spacing w:after="60"/>
+                  </w:pPr>
+                  <w:r>
+                    <w:rPr>
+                      <w:rtl/>
+                    </w:rPr>
+                    <w:t>8. يضيف المستخدم وسماً (</w:t>
+                  </w:r>
+                  <w:proofErr w:type="spellStart"/>
+                  <w:r>
+                    <w:rPr>
+                      <w:rtl/>
+                    </w:rPr>
+                    <w:t>Tag</w:t>
+                  </w:r>
+                  <w:proofErr w:type="spellEnd"/>
+                  <w:r>
+                    <w:rPr>
+                      <w:rtl/>
+                    </w:rPr>
+                    <w:t>) لكل سؤال لا يوجد له جدول مقابل في قاعدة البيانات</w:t>
+                  </w:r>
+                </w:p>
+              </w:tc>
+            </w:tr>
+            <w:tr>
+              <w:tblPrEx>
+                <w:tblCellMar>
+                  <w:top w:w="0" w:type="dxa"/>
+                  <w:bottom w:w="0" w:type="dxa"/>
+                </w:tblCellMar>
+              </w:tblPrEx>
+              <w:tc>
+                <w:tcPr>
+                  <w:tcW w:w="3250" w:type="dxa"/>
+                  <w:tcBorders>
+                    <w:top w:val="single" w:sz="6" w:space="0" w:color="000000"/>
+                    <w:left w:val="single" w:sz="6" w:space="0" w:color="000000"/>
+                    <w:bottom w:val="single" w:sz="6" w:space="0" w:color="000000"/>
+                    <w:right w:val="single" w:sz="6" w:space="0" w:color="000000"/>
+                  </w:tcBorders>
+                  <w:tcMar>
+                    <w:top w:w="80" w:type="dxa"/>
+                    <w:left w:w="120" w:type="dxa"/>
+                    <w:bottom w:w="80" w:type="dxa"/>
+                    <w:right w:w="120" w:type="dxa"/>
+                  </w:tcMar>
+                </w:tcPr>
+                <w:p>
+                  <w:pPr>
+                    <w:bidi/>
+                    <w:spacing w:after="60"/>
+                  </w:pPr>
+                </w:p>
+              </w:tc>
+              <w:tc>
+                <w:tcPr>
+                  <w:tcW w:w="3250" w:type="dxa"/>
+                  <w:tcBorders>
+                    <w:top w:val="single" w:sz="6" w:space="0" w:color="000000"/>
+                    <w:left w:val="single" w:sz="6" w:space="0" w:color="000000"/>
+                    <w:bottom w:val="single" w:sz="6" w:space="0" w:color="000000"/>
+                    <w:right w:val="single" w:sz="6" w:space="0" w:color="000000"/>
+                  </w:tcBorders>
+                  <w:tcMar>
+                    <w:top w:w="80" w:type="dxa"/>
+                    <w:left w:w="120" w:type="dxa"/>
+                    <w:bottom w:w="80" w:type="dxa"/>
+                    <w:right w:w="120" w:type="dxa"/>
+                  </w:tcMar>
+                </w:tcPr>
+                <w:p>
+                  <w:pPr>
+                    <w:bidi/>
+                    <w:spacing w:after="60"/>
+                  </w:pPr>
+                  <w:r>
+                    <w:rPr>
+                      <w:rtl/>
+                    </w:rPr>
+                    <w:t>9. يضغط المستخدم على حفظ</w:t>
+                  </w:r>
+                </w:p>
+              </w:tc>
+            </w:tr>
+            <w:tr>
+              <w:tblPrEx>
+                <w:tblCellMar>
+                  <w:top w:w="0" w:type="dxa"/>
+                  <w:bottom w:w="0" w:type="dxa"/>
+                </w:tblCellMar>
+              </w:tblPrEx>
+              <w:tc>
+                <w:tcPr>
+                  <w:tcW w:w="3250" w:type="dxa"/>
+                  <w:tcBorders>
+                    <w:top w:val="single" w:sz="6" w:space="0" w:color="000000"/>
+                    <w:left w:val="single" w:sz="6" w:space="0" w:color="000000"/>
+                    <w:bottom w:val="single" w:sz="6" w:space="0" w:color="000000"/>
+                    <w:right w:val="single" w:sz="6" w:space="0" w:color="000000"/>
+                  </w:tcBorders>
+                  <w:tcMar>
+                    <w:top w:w="80" w:type="dxa"/>
+                    <w:left w:w="120" w:type="dxa"/>
+                    <w:bottom w:w="80" w:type="dxa"/>
+                    <w:right w:w="120" w:type="dxa"/>
+                  </w:tcMar>
+                </w:tcPr>
+                <w:p>
+                  <w:pPr>
+                    <w:bidi/>
+                    <w:spacing w:after="60"/>
+                  </w:pPr>
+                  <w:r>
+                    <w:rPr>
+                      <w:rtl/>
+                    </w:rPr>
+                    <w:t>10. يتحقق النظ</w:t>
+                  </w:r>
+                  <w:r>
+                    <w:rPr>
+                      <w:rtl/>
+                    </w:rPr>
+                    <w:t>ام من اكتمال الحقول الإلزامية ومن صحة القيم (الميزانية وتسلسل التواريخ) ومن أن كل سؤال مرتبط بحقل أو موسوم.</w:t>
                   </w:r>
                 </w:p>
               </w:tc>
@@ -1337,7 +2121,21 @@
                     <w:rPr>
                       <w:rtl/>
                     </w:rPr>
-                    <w:t>8. يرسل النظام طلب موافقة إلى الأدمن لتثبيت الحملة.</w:t>
+                    <w:t>11. يحفظ النظام الحملة بالحالة الابتدائية "جديدة (</w:t>
+                  </w:r>
+                  <w:proofErr w:type="spellStart"/>
+                  <w:r>
+                    <w:rPr>
+                      <w:rtl/>
+                    </w:rPr>
+                    <w:t>New</w:t>
+                  </w:r>
+                  <w:proofErr w:type="spellEnd"/>
+                  <w:r>
+                    <w:rPr>
+                      <w:rtl/>
+                    </w:rPr>
+                    <w:t>)" مع ربط أسئلتها، ويهيئ ربطها بالعملاء عبر جدول الحملة والعميل.</w:t>
                   </w:r>
                 </w:p>
               </w:tc>
@@ -1397,7 +2195,147 @@
                     <w:rPr>
                       <w:rtl/>
                     </w:rPr>
-                    <w:t>9. يعرض النظام رسالة نجاح تفيد بحفظ الحملة وإرسالها للموافقة.</w:t>
+                    <w:t>12. يسجل النظام العملية في سجل التدقيق (المنفذ وتاريخ ووقت التنفيذ).</w:t>
+                  </w:r>
+                </w:p>
+              </w:tc>
+              <w:tc>
+                <w:tcPr>
+                  <w:tcW w:w="3250" w:type="dxa"/>
+                  <w:tcBorders>
+                    <w:top w:val="single" w:sz="6" w:space="0" w:color="000000"/>
+                    <w:left w:val="single" w:sz="6" w:space="0" w:color="000000"/>
+                    <w:bottom w:val="single" w:sz="6" w:space="0" w:color="000000"/>
+                    <w:right w:val="single" w:sz="6" w:space="0" w:color="000000"/>
+                  </w:tcBorders>
+                  <w:tcMar>
+                    <w:top w:w="80" w:type="dxa"/>
+                    <w:left w:w="120" w:type="dxa"/>
+                    <w:bottom w:w="80" w:type="dxa"/>
+                    <w:right w:w="120" w:type="dxa"/>
+                  </w:tcMar>
+                </w:tcPr>
+                <w:p>
+                  <w:pPr>
+                    <w:bidi/>
+                    <w:spacing w:after="60"/>
+                  </w:pPr>
+                </w:p>
+              </w:tc>
+            </w:tr>
+            <w:tr>
+              <w:tblPrEx>
+                <w:tblCellMar>
+                  <w:top w:w="0" w:type="dxa"/>
+                  <w:bottom w:w="0" w:type="dxa"/>
+                </w:tblCellMar>
+              </w:tblPrEx>
+              <w:tc>
+                <w:tcPr>
+                  <w:tcW w:w="3250" w:type="dxa"/>
+                  <w:tcBorders>
+                    <w:top w:val="single" w:sz="6" w:space="0" w:color="000000"/>
+                    <w:left w:val="single" w:sz="6" w:space="0" w:color="000000"/>
+                    <w:bottom w:val="single" w:sz="6" w:space="0" w:color="000000"/>
+                    <w:right w:val="single" w:sz="6" w:space="0" w:color="000000"/>
+                  </w:tcBorders>
+                  <w:tcMar>
+                    <w:top w:w="80" w:type="dxa"/>
+                    <w:left w:w="120" w:type="dxa"/>
+                    <w:bottom w:w="80" w:type="dxa"/>
+                    <w:right w:w="120" w:type="dxa"/>
+                  </w:tcMar>
+                </w:tcPr>
+                <w:p>
+                  <w:pPr>
+                    <w:bidi/>
+                    <w:spacing w:after="60"/>
+                  </w:pPr>
+                  <w:r>
+                    <w:rPr>
+                      <w:rtl/>
+                    </w:rPr>
+                    <w:t xml:space="preserve">13. يرسل النظام إشعاراً تلقائياً إلى </w:t>
+                  </w:r>
+                  <w:proofErr w:type="spellStart"/>
+                  <w:r>
+                    <w:rPr>
+                      <w:rtl/>
+                    </w:rPr>
+                    <w:t>الأدمن</w:t>
+                  </w:r>
+                  <w:proofErr w:type="spellEnd"/>
+                  <w:r>
+                    <w:rPr>
+                      <w:rtl/>
+                    </w:rPr>
+                    <w:t xml:space="preserve"> بطلب الموافقة على الح</w:t>
+                  </w:r>
+                  <w:r>
+                    <w:rPr>
+                      <w:rtl/>
+                    </w:rPr>
+                    <w:t>ملة.</w:t>
+                  </w:r>
+                </w:p>
+              </w:tc>
+              <w:tc>
+                <w:tcPr>
+                  <w:tcW w:w="3250" w:type="dxa"/>
+                  <w:tcBorders>
+                    <w:top w:val="single" w:sz="6" w:space="0" w:color="000000"/>
+                    <w:left w:val="single" w:sz="6" w:space="0" w:color="000000"/>
+                    <w:bottom w:val="single" w:sz="6" w:space="0" w:color="000000"/>
+                    <w:right w:val="single" w:sz="6" w:space="0" w:color="000000"/>
+                  </w:tcBorders>
+                  <w:tcMar>
+                    <w:top w:w="80" w:type="dxa"/>
+                    <w:left w:w="120" w:type="dxa"/>
+                    <w:bottom w:w="80" w:type="dxa"/>
+                    <w:right w:w="120" w:type="dxa"/>
+                  </w:tcMar>
+                </w:tcPr>
+                <w:p>
+                  <w:pPr>
+                    <w:bidi/>
+                    <w:spacing w:after="60"/>
+                  </w:pPr>
+                </w:p>
+              </w:tc>
+            </w:tr>
+            <w:tr>
+              <w:tblPrEx>
+                <w:tblCellMar>
+                  <w:top w:w="0" w:type="dxa"/>
+                  <w:bottom w:w="0" w:type="dxa"/>
+                </w:tblCellMar>
+              </w:tblPrEx>
+              <w:tc>
+                <w:tcPr>
+                  <w:tcW w:w="3250" w:type="dxa"/>
+                  <w:tcBorders>
+                    <w:top w:val="single" w:sz="6" w:space="0" w:color="000000"/>
+                    <w:left w:val="single" w:sz="6" w:space="0" w:color="000000"/>
+                    <w:bottom w:val="single" w:sz="6" w:space="0" w:color="000000"/>
+                    <w:right w:val="single" w:sz="6" w:space="0" w:color="000000"/>
+                  </w:tcBorders>
+                  <w:tcMar>
+                    <w:top w:w="80" w:type="dxa"/>
+                    <w:left w:w="120" w:type="dxa"/>
+                    <w:bottom w:w="80" w:type="dxa"/>
+                    <w:right w:w="120" w:type="dxa"/>
+                  </w:tcMar>
+                </w:tcPr>
+                <w:p>
+                  <w:pPr>
+                    <w:bidi/>
+                    <w:spacing w:after="60"/>
+                  </w:pPr>
+                  <w:r>
+                    <w:rPr>
+                      <w:rtl/>
+                    </w:rPr>
+                    <w:t>14. يعرض النظام رسالة نجاح تفيد بحفظ الحملة وإرسالها للموافقة.</w:t>
                   </w:r>
                 </w:p>
               </w:tc>
@@ -1499,125 +2437,308 @@
                 <w:bCs/>
                 <w:rtl/>
               </w:rPr>
-              <w:t>الخطوة 5 – بيانات ناقصة أو غير صحيحة:</w:t>
-            </w:r>
-          </w:p>
-          <w:p>
-            <w:pPr>
-              <w:bidi/>
-              <w:spacing w:after="60"/>
-            </w:pPr>
-            <w:r>
-              <w:rPr>
-                <w:rtl/>
-              </w:rPr>
-              <w:t>1. يكتشف النظام أن أحد الحقول الإلزامية فارغ (الميزانية، تاريخ البداية، تاريخ النهاية، أو المسار المستهدف).</w:t>
-            </w:r>
-          </w:p>
-          <w:p>
-            <w:pPr>
-              <w:bidi/>
-              <w:spacing w:after="60"/>
-            </w:pPr>
-            <w:r>
-              <w:rPr>
-                <w:rtl/>
-              </w:rPr>
-              <w:t>2. يعرض النظام رسالة توضح الحقول المطلوبة دون حفظ الحملة.</w:t>
-            </w:r>
-          </w:p>
-          <w:p>
-            <w:pPr>
-              <w:bidi/>
-              <w:spacing w:after="60"/>
-            </w:pPr>
-            <w:r>
-              <w:rPr>
-                <w:rtl/>
-              </w:rPr>
-              <w:t>3. العودة إلى الخطوة 3.</w:t>
-            </w:r>
-          </w:p>
-          <w:p>
-            <w:pPr>
-              <w:bidi/>
-              <w:spacing w:after="80"/>
-            </w:pPr>
-          </w:p>
-          <w:p>
-            <w:pPr>
-              <w:bidi/>
-              <w:spacing w:after="60"/>
-            </w:pPr>
+              <w:t xml:space="preserve">الخطوة 5 – تعذر جلب الأسئلة من </w:t>
+            </w:r>
+            <w:proofErr w:type="spellStart"/>
             <w:r>
               <w:rPr>
                 <w:b/>
                 <w:bCs/>
                 <w:rtl/>
               </w:rPr>
-              <w:t>الخطوة 5 – قيم مخالفة للقواعد المنطقية:</w:t>
-            </w:r>
-          </w:p>
-          <w:p>
-            <w:pPr>
-              <w:bidi/>
-              <w:spacing w:after="60"/>
-            </w:pPr>
-            <w:r>
-              <w:rPr>
-                <w:rtl/>
-              </w:rPr>
-              <w:t>1. يكتشف النظام أن الميزا</w:t>
-            </w:r>
-            <w:r>
-              <w:rPr>
-                <w:rtl/>
-              </w:rPr>
-              <w:t>نية ليست رقماً موجباً، أو أن تاريخ النهاية لا يقع بعد تاريخ البداية.</w:t>
-            </w:r>
-          </w:p>
-          <w:p>
-            <w:pPr>
-              <w:bidi/>
-              <w:spacing w:after="60"/>
-            </w:pPr>
-            <w:r>
-              <w:rPr>
-                <w:rtl/>
-              </w:rPr>
-              <w:t>2. يعرض النظام رسالة تبين سبب الخطأ ويحدد الحقل المخالف.</w:t>
-            </w:r>
-          </w:p>
-          <w:p>
-            <w:pPr>
-              <w:bidi/>
-              <w:spacing w:after="60"/>
-            </w:pPr>
-            <w:r>
-              <w:rPr>
-                <w:rtl/>
-              </w:rPr>
-              <w:t>3. العودة إلى الخطوة 3.</w:t>
-            </w:r>
-          </w:p>
-          <w:p>
-            <w:pPr>
-              <w:bidi/>
-              <w:spacing w:after="80"/>
-            </w:pPr>
-          </w:p>
-          <w:p>
-            <w:pPr>
-              <w:bidi/>
-              <w:spacing w:after="60"/>
-            </w:pPr>
+              <w:t>Google</w:t>
+            </w:r>
+            <w:proofErr w:type="spellEnd"/>
             <w:r>
               <w:rPr>
                 <w:b/>
                 <w:bCs/>
                 <w:rtl/>
               </w:rPr>
-              <w:t>الخطوات 3 إلى 4 – إلغاء العملية:</w:t>
+              <w:t xml:space="preserve"> </w:t>
+            </w:r>
+            <w:proofErr w:type="spellStart"/>
+            <w:r>
+              <w:rPr>
+                <w:b/>
+                <w:bCs/>
+                <w:rtl/>
+              </w:rPr>
+              <w:t>Sheets</w:t>
+            </w:r>
+            <w:proofErr w:type="spellEnd"/>
+            <w:r>
+              <w:rPr>
+                <w:b/>
+                <w:bCs/>
+                <w:rtl/>
+              </w:rPr>
+              <w:t>:</w:t>
+            </w:r>
+          </w:p>
+          <w:p>
+            <w:pPr>
+              <w:bidi/>
+              <w:spacing w:after="60"/>
+            </w:pPr>
+            <w:r>
+              <w:rPr>
+                <w:rtl/>
+              </w:rPr>
+              <w:t>1. يفشل النظام في الاتصال بالملف أو لا يملك صلاحية قراءته، أو يكون الرابط غير صحيح، أو لا يحتوي الملف على أسئلة.</w:t>
+            </w:r>
+          </w:p>
+          <w:p>
+            <w:pPr>
+              <w:bidi/>
+              <w:spacing w:after="60"/>
+            </w:pPr>
+            <w:r>
+              <w:rPr>
+                <w:rtl/>
+              </w:rPr>
+              <w:t>2. يعرض النظام رسالة خطأ توضح السبب دون المتابعة.</w:t>
+            </w:r>
+          </w:p>
+          <w:p>
+            <w:pPr>
+              <w:bidi/>
+              <w:spacing w:after="60"/>
+            </w:pPr>
+            <w:r>
+              <w:rPr>
+                <w:rtl/>
+              </w:rPr>
+              <w:t>3. العودة إلى الخطوة 3.</w:t>
+            </w:r>
+          </w:p>
+          <w:p>
+            <w:pPr>
+              <w:bidi/>
+              <w:spacing w:after="80"/>
+            </w:pPr>
+          </w:p>
+          <w:p>
+            <w:pPr>
+              <w:bidi/>
+              <w:spacing w:after="60"/>
+            </w:pPr>
+            <w:r>
+              <w:rPr>
+                <w:b/>
+                <w:bCs/>
+                <w:rtl/>
+              </w:rPr>
+              <w:t>الخطوة 10 – بيانات ناقصة أو غير صحيحة:</w:t>
+            </w:r>
+          </w:p>
+          <w:p>
+            <w:pPr>
+              <w:bidi/>
+              <w:spacing w:after="60"/>
+            </w:pPr>
+            <w:r>
+              <w:rPr>
+                <w:rtl/>
+              </w:rPr>
+              <w:t>1. يكتشف النظام أن أحد الحقول</w:t>
+            </w:r>
+            <w:r>
+              <w:rPr>
+                <w:rtl/>
+              </w:rPr>
+              <w:t xml:space="preserve"> الإلزامية فارغ (الميزانية، تاريخ البداية، تاريخ النهاية، المسار المستهدف، أو رابط </w:t>
+            </w:r>
+            <w:proofErr w:type="spellStart"/>
+            <w:r>
+              <w:rPr>
+                <w:rtl/>
+              </w:rPr>
+              <w:t>Google</w:t>
+            </w:r>
+            <w:proofErr w:type="spellEnd"/>
+            <w:r>
+              <w:rPr>
+                <w:rtl/>
+              </w:rPr>
+              <w:t xml:space="preserve"> </w:t>
+            </w:r>
+            <w:proofErr w:type="spellStart"/>
+            <w:r>
+              <w:rPr>
+                <w:rtl/>
+              </w:rPr>
+              <w:t>Sheets</w:t>
+            </w:r>
+            <w:proofErr w:type="spellEnd"/>
+            <w:r>
+              <w:rPr>
+                <w:rtl/>
+              </w:rPr>
+              <w:t>).</w:t>
+            </w:r>
+          </w:p>
+          <w:p>
+            <w:pPr>
+              <w:bidi/>
+              <w:spacing w:after="60"/>
+            </w:pPr>
+            <w:r>
+              <w:rPr>
+                <w:rtl/>
+              </w:rPr>
+              <w:t>2. يعرض النظام رسالة توضح الحقول المطلوبة دون حفظ الحملة.</w:t>
+            </w:r>
+          </w:p>
+          <w:p>
+            <w:pPr>
+              <w:bidi/>
+              <w:spacing w:after="60"/>
+            </w:pPr>
+            <w:r>
+              <w:rPr>
+                <w:rtl/>
+              </w:rPr>
+              <w:t>3. العودة إلى الخطوة 3.</w:t>
+            </w:r>
+          </w:p>
+          <w:p>
+            <w:pPr>
+              <w:bidi/>
+              <w:spacing w:after="80"/>
+            </w:pPr>
+          </w:p>
+          <w:p>
+            <w:pPr>
+              <w:bidi/>
+              <w:spacing w:after="60"/>
+            </w:pPr>
+            <w:r>
+              <w:rPr>
+                <w:b/>
+                <w:bCs/>
+                <w:rtl/>
+              </w:rPr>
+              <w:t>الخطوة 10 – قيم مخالفة للقواعد المنطقية:</w:t>
+            </w:r>
+          </w:p>
+          <w:p>
+            <w:pPr>
+              <w:bidi/>
+              <w:spacing w:after="60"/>
+            </w:pPr>
+            <w:r>
+              <w:rPr>
+                <w:rtl/>
+              </w:rPr>
+              <w:lastRenderedPageBreak/>
+              <w:t>1. يكتشف النظام أن الميزانية ليست رقماً موجباً، أو أن تاريخ النهاية لا يقع بعد تاريخ البداية.</w:t>
+            </w:r>
+          </w:p>
+          <w:p>
+            <w:pPr>
+              <w:bidi/>
+              <w:spacing w:after="60"/>
+            </w:pPr>
+            <w:r>
+              <w:rPr>
+                <w:rtl/>
+              </w:rPr>
+              <w:t>2. يعرض النظام رسالة تبين سبب الخطأ ويحدد الحقل المخالف.</w:t>
+            </w:r>
+          </w:p>
+          <w:p>
+            <w:pPr>
+              <w:bidi/>
+              <w:spacing w:after="60"/>
+            </w:pPr>
+            <w:r>
+              <w:rPr>
+                <w:rtl/>
+              </w:rPr>
+              <w:t>3. العودة إلى الخطوة 3.</w:t>
+            </w:r>
+          </w:p>
+          <w:p>
+            <w:pPr>
+              <w:bidi/>
+              <w:spacing w:after="80"/>
+            </w:pPr>
+          </w:p>
+          <w:p>
+            <w:pPr>
+              <w:bidi/>
+              <w:spacing w:after="60"/>
+            </w:pPr>
+            <w:r>
+              <w:rPr>
+                <w:b/>
+                <w:bCs/>
+                <w:rtl/>
+              </w:rPr>
+              <w:t>الخطوة 10 – أسئلة غير مرتبطة:</w:t>
+            </w:r>
+          </w:p>
+          <w:p>
+            <w:pPr>
+              <w:bidi/>
+              <w:spacing w:after="60"/>
+            </w:pPr>
+            <w:r>
+              <w:rPr>
+                <w:rtl/>
+              </w:rPr>
+              <w:t xml:space="preserve">1. يكتشف </w:t>
+            </w:r>
+            <w:r>
+              <w:rPr>
+                <w:rtl/>
+              </w:rPr>
+              <w:t>النظام وجود سؤال واحد أو أكثر غير مرتبط بحقل في قاعدة البيانات ولا يحمل وسماً.</w:t>
+            </w:r>
+          </w:p>
+          <w:p>
+            <w:pPr>
+              <w:bidi/>
+              <w:spacing w:after="60"/>
+            </w:pPr>
+            <w:r>
+              <w:rPr>
+                <w:rtl/>
+              </w:rPr>
+              <w:t>2. يعرض النظام رسالة تحدد الأسئلة غير المرتبطة دون حفظ الحملة.</w:t>
+            </w:r>
+          </w:p>
+          <w:p>
+            <w:pPr>
+              <w:bidi/>
+              <w:spacing w:after="60"/>
+            </w:pPr>
+            <w:r>
+              <w:rPr>
+                <w:rtl/>
+              </w:rPr>
+              <w:t>3. العودة إلى الخطوة 7.</w:t>
+            </w:r>
+          </w:p>
+          <w:p>
+            <w:pPr>
+              <w:bidi/>
+              <w:spacing w:after="80"/>
+            </w:pPr>
+          </w:p>
+          <w:p>
+            <w:pPr>
+              <w:bidi/>
+              <w:spacing w:after="60"/>
+            </w:pPr>
+            <w:r>
+              <w:rPr>
+                <w:b/>
+                <w:bCs/>
+                <w:rtl/>
+              </w:rPr>
+              <w:t>الخطوات 3 إلى 9 – إلغاء العملية:</w:t>
             </w:r>
           </w:p>
           <w:p>
@@ -1641,7 +2762,13 @@
               <w:rPr>
                 <w:rtl/>
               </w:rPr>
-              <w:t>2. يتجاهل النظام البيانات المدخلة دون حفظها.</w:t>
+              <w:t>2. يتجاهل الن</w:t>
+            </w:r>
+            <w:r>
+              <w:rPr>
+                <w:rtl/>
+              </w:rPr>
+              <w:t>ظام البيانات المدخلة وارتباطات الأسئلة دون حفظها.</w:t>
             </w:r>
           </w:p>
           <w:p>
@@ -1689,6 +2816,7 @@
                 <w:b/>
                 <w:bCs/>
               </w:rPr>
+              <w:lastRenderedPageBreak/>
               <w:t>Alternative Flow of Events</w:t>
             </w:r>
           </w:p>
@@ -1709,10 +2837,10 @@
 <file path=word/numbering.xml><?xml version="1.0" encoding="utf-8"?>
 <w:numbering xmlns:wpc="http://schemas.microsoft.com/office/word/2010/wordprocessingCanvas" xmlns:cx="http://schemas.microsoft.com/office/drawing/2014/chartex" xmlns:cx1="http://schemas.microsoft.com/office/drawing/2015/9/8/chartex" xmlns:cx2="http://schemas.microsoft.com/office/drawing/2015/10/21/chartex" xmlns:cx3="http://schemas.microsoft.com/office/drawing/2016/5/9/chartex" xmlns:cx4="http://schemas.microsoft.com/office/drawing/2016/5/10/chartex" xmlns:cx5="http://schemas.microsoft.com/office/drawing/2016/5/11/chartex" xmlns:cx6="http://schemas.microsoft.com/office/drawing/2016/5/12/chartex" xmlns:cx7="http://schemas.microsoft.com/office/drawing/2016/5/13/chartex" xmlns:cx8="http://schemas.microsoft.com/office/drawing/2016/5/14/chartex" xmlns:mc="http://schemas.openxmlformats.org/markup-compatibility/2006" xmlns:aink="http://schemas.microsoft.com/office/drawing/2016/ink" xmlns:am3d="http://schemas.microsoft.com/office/drawing/2017/model3d" xmlns:o="urn:schemas-microsoft-com:office:office" xmlns:r="http://schemas.openxmlformats.org/officeDocument/2006/relationships" xmlns:m="http://schemas.openxmlformats.org/officeDocument/2006/math" xmlns:v="urn:schemas-microsoft-com:vml" xmlns:wp14="http://schemas.microsoft.com/office/word/2010/wordprocessingDrawing" xmlns:wp="http://schemas.openxmlformats.org/drawingml/2006/wordprocessingDrawing" xmlns:w10="urn:schemas-microsoft-com:office:word" xmlns:w="http://schemas.openxmlformats.org/wordprocessingml/2006/main" xmlns:w14="http://schemas.microsoft.com/office/word/2010/wordml" xmlns:w15="http://schemas.microsoft.com/office/word/2012/wordml" xmlns:w16cex="http://schemas.microsoft.com/office/word/2018/wordml/cex" xmlns:w16cid="http://schemas.microsoft.com/office/word/2016/wordml/cid" xmlns:w16="http://schemas.microsoft.com/office/word/2018/wordml" xmlns:w16sdtdh="http://schemas.microsoft.com/office/word/2020/wordml/sdtdatahash" xmlns:w16se="http://schemas.microsoft.com/office/word/2015/wordml/symex" xmlns:wpg="http://schemas.microsoft.com/office/word/2010/wordprocessingGroup" xmlns:wpi="http://schemas.microsoft.com/office/word/2010/wordprocessingInk" xmlns:wne="http://schemas.microsoft.com/office/word/2006/wordml" xmlns:wps="http://schemas.microsoft.com/office/word/2010/wordprocessingShape" mc:Ignorable="w14 w15 w16se w16cid w16 w16cex w16sdtdh wp14">
   <w:abstractNum w:abstractNumId="0" w15:restartNumberingAfterBreak="0">
-    <w:nsid w:val="55770320"/>
+    <w:nsid w:val="19811172"/>
     <w:multiLevelType w:val="hybridMultilevel"/>
-    <w:tmpl w:val="06B2266E"/>
-    <w:lvl w:ilvl="0" w:tplc="B8148A9A">
+    <w:tmpl w:val="EB5A8736"/>
+    <w:lvl w:ilvl="0" w:tplc="9C0AA418">
       <w:start w:val="1"/>
       <w:numFmt w:val="bullet"/>
       <w:lvlText w:val="●"/>
@@ -1721,7 +2849,7 @@
         <w:ind w:left="720" w:hanging="360"/>
       </w:pPr>
     </w:lvl>
-    <w:lvl w:ilvl="1" w:tplc="C62C0E02">
+    <w:lvl w:ilvl="1" w:tplc="D376F380">
       <w:start w:val="1"/>
       <w:numFmt w:val="bullet"/>
       <w:lvlText w:val="○"/>
@@ -1730,7 +2858,7 @@
         <w:ind w:left="1440" w:hanging="360"/>
       </w:pPr>
     </w:lvl>
-    <w:lvl w:ilvl="2" w:tplc="B0D6874E">
+    <w:lvl w:ilvl="2" w:tplc="3C145596">
       <w:start w:val="1"/>
       <w:numFmt w:val="bullet"/>
       <w:lvlText w:val="■"/>
@@ -1739,7 +2867,7 @@
         <w:ind w:left="2160" w:hanging="360"/>
       </w:pPr>
     </w:lvl>
-    <w:lvl w:ilvl="3" w:tplc="4EC67E36">
+    <w:lvl w:ilvl="3" w:tplc="C278215C">
       <w:start w:val="1"/>
       <w:numFmt w:val="bullet"/>
       <w:lvlText w:val="●"/>
@@ -1748,7 +2876,7 @@
         <w:ind w:left="2880" w:hanging="360"/>
       </w:pPr>
     </w:lvl>
-    <w:lvl w:ilvl="4" w:tplc="48E28CD2">
+    <w:lvl w:ilvl="4" w:tplc="4A54E042">
       <w:start w:val="1"/>
       <w:numFmt w:val="bullet"/>
       <w:lvlText w:val="○"/>
@@ -1757,7 +2885,7 @@
         <w:ind w:left="3600" w:hanging="360"/>
       </w:pPr>
     </w:lvl>
-    <w:lvl w:ilvl="5" w:tplc="EC484B56">
+    <w:lvl w:ilvl="5" w:tplc="C1B6D4D6">
       <w:start w:val="1"/>
       <w:numFmt w:val="bullet"/>
       <w:lvlText w:val="■"/>
@@ -1766,7 +2894,7 @@
         <w:ind w:left="4320" w:hanging="360"/>
       </w:pPr>
     </w:lvl>
-    <w:lvl w:ilvl="6" w:tplc="6F3251BE">
+    <w:lvl w:ilvl="6" w:tplc="9838380C">
       <w:start w:val="1"/>
       <w:numFmt w:val="bullet"/>
       <w:lvlText w:val="●"/>
@@ -1775,7 +2903,7 @@
         <w:ind w:left="5040" w:hanging="360"/>
       </w:pPr>
     </w:lvl>
-    <w:lvl w:ilvl="7" w:tplc="4E14ADF2">
+    <w:lvl w:ilvl="7" w:tplc="B088EFA4">
       <w:start w:val="1"/>
       <w:numFmt w:val="bullet"/>
       <w:lvlText w:val="●"/>
@@ -1784,7 +2912,7 @@
         <w:ind w:left="5760" w:hanging="360"/>
       </w:pPr>
     </w:lvl>
-    <w:lvl w:ilvl="8" w:tplc="91FC1ECA">
+    <w:lvl w:ilvl="8" w:tplc="2AFA1E80">
       <w:start w:val="1"/>
       <w:numFmt w:val="bullet"/>
       <w:lvlText w:val="●"/>

</xml_diff>